<commit_message>
Regenerate docs (Quarto 1.8.27)
Regenerate site with Quarto 1.8.27. Updated HTML/PDF/DOCX outputs for corrections, notes, practicals and utils (including many docs/* files and binary artifacts). HTML changes include a Quarto generator bump, updated Hypothesis asset manifest/hashes and asset versions, changed auto-generated element IDs/CSS selectors in table containers, and a small sidebar header markup removal. Also updated search.json and renamed a quarto syntax-highlighting CSS asset under site_libs.
</commit_message>
<xml_diff>
--- a/docs/practicals/exercise4_instructions.docx
+++ b/docs/practicals/exercise4_instructions.docx
@@ -287,7 +287,7 @@
                     <a:graphicData uri="http://schemas.openxmlformats.org/drawingml/2006/picture">
                       <pic:pic>
                         <pic:nvPicPr>
-                          <pic:cNvPr descr="C:\PROGRA~1\Quarto\share\formats\docx\tip.png" id="24" name="Picture"/>
+                          <pic:cNvPr descr="C:\Users\langhe\AppData\Local\Programs\Quarto\share\formats\docx\tip.png" id="24" name="Picture"/>
                           <pic:cNvPicPr>
                             <a:picLocks noChangeArrowheads="1" noChangeAspect="1"/>
                           </pic:cNvPicPr>
@@ -476,7 +476,7 @@
                     <a:graphicData uri="http://schemas.openxmlformats.org/drawingml/2006/picture">
                       <pic:pic>
                         <pic:nvPicPr>
-                          <pic:cNvPr descr="C:\PROGRA~1\Quarto\share\formats\docx\tip.png" id="28" name="Picture"/>
+                          <pic:cNvPr descr="C:\Users\langhe\AppData\Local\Programs\Quarto\share\formats\docx\tip.png" id="28" name="Picture"/>
                           <pic:cNvPicPr>
                             <a:picLocks noChangeArrowheads="1" noChangeAspect="1"/>
                           </pic:cNvPicPr>
@@ -823,7 +823,7 @@
                     <a:graphicData uri="http://schemas.openxmlformats.org/drawingml/2006/picture">
                       <pic:pic>
                         <pic:nvPicPr>
-                          <pic:cNvPr descr="C:\PROGRA~1\Quarto\share\formats\docx\tip.png" id="32" name="Picture"/>
+                          <pic:cNvPr descr="C:\Users\langhe\AppData\Local\Programs\Quarto\share\formats\docx\tip.png" id="32" name="Picture"/>
                           <pic:cNvPicPr>
                             <a:picLocks noChangeArrowheads="1" noChangeAspect="1"/>
                           </pic:cNvPicPr>
@@ -1165,7 +1165,7 @@
                     <a:graphicData uri="http://schemas.openxmlformats.org/drawingml/2006/picture">
                       <pic:pic>
                         <pic:nvPicPr>
-                          <pic:cNvPr descr="C:\PROGRA~1\Quarto\share\formats\docx\tip.png" id="38" name="Picture"/>
+                          <pic:cNvPr descr="C:\Users\langhe\AppData\Local\Programs\Quarto\share\formats\docx\tip.png" id="38" name="Picture"/>
                           <pic:cNvPicPr>
                             <a:picLocks noChangeArrowheads="1" noChangeAspect="1"/>
                           </pic:cNvPicPr>
@@ -1301,7 +1301,7 @@
                     <a:graphicData uri="http://schemas.openxmlformats.org/drawingml/2006/picture">
                       <pic:pic>
                         <pic:nvPicPr>
-                          <pic:cNvPr descr="C:\PROGRA~1\Quarto\share\formats\docx\important.png" id="42" name="Picture"/>
+                          <pic:cNvPr descr="C:\Users\langhe\AppData\Local\Programs\Quarto\share\formats\docx\important.png" id="42" name="Picture"/>
                           <pic:cNvPicPr>
                             <a:picLocks noChangeArrowheads="1" noChangeAspect="1"/>
                           </pic:cNvPicPr>
@@ -1600,7 +1600,7 @@
                     <a:graphicData uri="http://schemas.openxmlformats.org/drawingml/2006/picture">
                       <pic:pic>
                         <pic:nvPicPr>
-                          <pic:cNvPr descr="C:\PROGRA~1\Quarto\share\formats\docx\tip.png" id="47" name="Picture"/>
+                          <pic:cNvPr descr="C:\Users\langhe\AppData\Local\Programs\Quarto\share\formats\docx\tip.png" id="47" name="Picture"/>
                           <pic:cNvPicPr>
                             <a:picLocks noChangeArrowheads="1" noChangeAspect="1"/>
                           </pic:cNvPicPr>
@@ -1828,7 +1828,7 @@
                     <a:graphicData uri="http://schemas.openxmlformats.org/drawingml/2006/picture">
                       <pic:pic>
                         <pic:nvPicPr>
-                          <pic:cNvPr descr="C:\PROGRA~1\Quarto\share\formats\docx\tip.png" id="53" name="Picture"/>
+                          <pic:cNvPr descr="C:\Users\langhe\AppData\Local\Programs\Quarto\share\formats\docx\tip.png" id="53" name="Picture"/>
                           <pic:cNvPicPr>
                             <a:picLocks noChangeArrowheads="1" noChangeAspect="1"/>
                           </pic:cNvPicPr>
@@ -2152,7 +2152,7 @@
                     <a:graphicData uri="http://schemas.openxmlformats.org/drawingml/2006/picture">
                       <pic:pic>
                         <pic:nvPicPr>
-                          <pic:cNvPr descr="C:\PROGRA~1\Quarto\share\formats\docx\tip.png" id="58" name="Picture"/>
+                          <pic:cNvPr descr="C:\Users\langhe\AppData\Local\Programs\Quarto\share\formats\docx\tip.png" id="58" name="Picture"/>
                           <pic:cNvPicPr>
                             <a:picLocks noChangeArrowheads="1" noChangeAspect="1"/>
                           </pic:cNvPicPr>
@@ -2409,7 +2409,7 @@
                     <a:graphicData uri="http://schemas.openxmlformats.org/drawingml/2006/picture">
                       <pic:pic>
                         <pic:nvPicPr>
-                          <pic:cNvPr descr="C:\PROGRA~1\Quarto\share\formats\docx\tip.png" id="65" name="Picture"/>
+                          <pic:cNvPr descr="C:\Users\langhe\AppData\Local\Programs\Quarto\share\formats\docx\tip.png" id="65" name="Picture"/>
                           <pic:cNvPicPr>
                             <a:picLocks noChangeArrowheads="1" noChangeAspect="1"/>
                           </pic:cNvPicPr>

</xml_diff>